<commit_message>
Bitacoras 9 y 10
</commit_message>
<xml_diff>
--- a/GFPI-F-023_V06.__Formato_de_Planeación_Seguimiento_y_Evaluación_de_Etapa_Productiva.docx
+++ b/GFPI-F-023_V06.__Formato_de_Planeación_Seguimiento_y_Evaluación_de_Etapa_Productiva.docx
@@ -16106,14 +16106,44 @@
               <w:jc w:val="left"/>
               <w:rPr>
                 <w:rFonts w:ascii="Calibri" w:hAnsi="Calibri" w:cs="Calibri"/>
-                <w:b/>
-                <w:bCs/>
-                <w:sz w:val="18"/>
-                <w:szCs w:val="18"/>
-                <w:lang w:val="es-CO" w:eastAsia="es-CO"/>
-                <w14:ligatures w14:val="none"/>
-              </w:rPr>
-            </w:pPr>
+                <w:sz w:val="18"/>
+                <w:szCs w:val="18"/>
+                <w:lang w:val="es-CO" w:eastAsia="es-CO"/>
+                <w14:ligatures w14:val="none"/>
+              </w:rPr>
+            </w:pPr>
+            <w:r>
+              <w:rPr>
+                <w:rFonts w:ascii="Calibri" w:hAnsi="Calibri" w:cs="Calibri"/>
+                <w:sz w:val="18"/>
+                <w:szCs w:val="18"/>
+                <w:lang w:val="es-CO" w:eastAsia="es-CO"/>
+                <w14:ligatures w14:val="none"/>
+              </w:rPr>
+              <w:t xml:space="preserve">Mi experiencia en BTG </w:t>
+            </w:r>
+            <w:proofErr w:type="spellStart"/>
+            <w:r>
+              <w:rPr>
+                <w:rFonts w:ascii="Calibri" w:hAnsi="Calibri" w:cs="Calibri"/>
+                <w:sz w:val="18"/>
+                <w:szCs w:val="18"/>
+                <w:lang w:val="es-CO" w:eastAsia="es-CO"/>
+                <w14:ligatures w14:val="none"/>
+              </w:rPr>
+              <w:t>Pactual</w:t>
+            </w:r>
+            <w:proofErr w:type="spellEnd"/>
+            <w:r>
+              <w:rPr>
+                <w:rFonts w:ascii="Calibri" w:hAnsi="Calibri" w:cs="Calibri"/>
+                <w:sz w:val="18"/>
+                <w:szCs w:val="18"/>
+                <w:lang w:val="es-CO" w:eastAsia="es-CO"/>
+                <w14:ligatures w14:val="none"/>
+              </w:rPr>
+              <w:t xml:space="preserve"> ha sido maravillosa durante estos meses. He adquirido una gran cantidad de conocimientos y aprendizajes que han fortalecido tanto mis habilidades técnicas como personales. Me he sentido muy cómodo trabajando con el equipo, siempre dispuesto a apoyar y compartir su experiencia.</w:t>
+            </w:r>
           </w:p>
           <w:p>
             <w:pPr>
@@ -16121,74 +16151,22 @@
               <w:jc w:val="left"/>
               <w:rPr>
                 <w:rFonts w:ascii="Calibri" w:hAnsi="Calibri" w:cs="Calibri"/>
-                <w:b/>
-                <w:bCs/>
-                <w:sz w:val="18"/>
-                <w:szCs w:val="18"/>
-                <w:lang w:val="es-CO" w:eastAsia="es-CO"/>
-                <w14:ligatures w14:val="none"/>
-              </w:rPr>
-            </w:pPr>
-          </w:p>
-          <w:p>
-            <w:pPr>
-              <w:spacing w:before="0" w:after="0"/>
-              <w:jc w:val="left"/>
-              <w:rPr>
-                <w:rFonts w:ascii="Calibri" w:hAnsi="Calibri" w:cs="Calibri"/>
-                <w:b/>
-                <w:bCs/>
-                <w:sz w:val="18"/>
-                <w:szCs w:val="18"/>
-                <w:lang w:val="es-CO" w:eastAsia="es-CO"/>
-                <w14:ligatures w14:val="none"/>
-              </w:rPr>
-            </w:pPr>
-          </w:p>
-          <w:p>
-            <w:pPr>
-              <w:spacing w:before="0" w:after="0"/>
-              <w:jc w:val="left"/>
-              <w:rPr>
-                <w:rFonts w:ascii="Calibri" w:hAnsi="Calibri" w:cs="Calibri"/>
-                <w:b/>
-                <w:bCs/>
-                <w:sz w:val="18"/>
-                <w:szCs w:val="18"/>
-                <w:lang w:val="es-CO" w:eastAsia="es-CO"/>
-                <w14:ligatures w14:val="none"/>
-              </w:rPr>
-            </w:pPr>
-          </w:p>
-          <w:p>
-            <w:pPr>
-              <w:spacing w:before="0" w:after="0"/>
-              <w:jc w:val="left"/>
-              <w:rPr>
-                <w:rFonts w:ascii="Calibri" w:hAnsi="Calibri" w:cs="Calibri"/>
-                <w:b/>
-                <w:bCs/>
-                <w:sz w:val="18"/>
-                <w:szCs w:val="18"/>
-                <w:lang w:val="es-CO" w:eastAsia="es-CO"/>
-                <w14:ligatures w14:val="none"/>
-              </w:rPr>
-            </w:pPr>
-          </w:p>
-          <w:p>
-            <w:pPr>
-              <w:spacing w:before="0" w:after="0"/>
-              <w:jc w:val="left"/>
-              <w:rPr>
-                <w:rFonts w:ascii="Calibri" w:hAnsi="Calibri" w:cs="Calibri"/>
-                <w:b/>
-                <w:bCs/>
-                <w:sz w:val="18"/>
-                <w:szCs w:val="18"/>
-                <w:lang w:val="es-CO" w:eastAsia="es-CO"/>
-                <w14:ligatures w14:val="none"/>
-              </w:rPr>
-            </w:pPr>
+                <w:sz w:val="18"/>
+                <w:szCs w:val="18"/>
+                <w:lang w:val="es-CO" w:eastAsia="es-CO"/>
+                <w14:ligatures w14:val="none"/>
+              </w:rPr>
+            </w:pPr>
+            <w:r>
+              <w:rPr>
+                <w:rFonts w:ascii="Calibri" w:hAnsi="Calibri" w:cs="Calibri"/>
+                <w:sz w:val="18"/>
+                <w:szCs w:val="18"/>
+                <w:lang w:val="es-CO" w:eastAsia="es-CO"/>
+                <w14:ligatures w14:val="none"/>
+              </w:rPr>
+              <w:t>Además, he tenido la oportunidad de enfrentar nuevos retos que me han permitido crecer profesionalmente, mejorar mi capacidad de análisis y adaptarme a diferentes escenarios. Sin duda, ha sido una etapa de mucho crecimiento y aprendizaje continuo.</w:t>
+            </w:r>
           </w:p>
           <w:p>
             <w:pPr>
@@ -24501,7 +24479,6 @@
   <w:style w:type="character" w:default="1" w:styleId="Fuentedeprrafopredeter">
     <w:name w:val="Default Paragraph Font"/>
     <w:uiPriority w:val="1"/>
-    <w:semiHidden/>
     <w:unhideWhenUsed/>
   </w:style>
   <w:style w:type="table" w:default="1" w:styleId="Tablanormal">

</xml_diff>